<commit_message>
Updated predictions paper with new predictions
</commit_message>
<xml_diff>
--- a/papers/_sources/falsifiable_predictions.docx
+++ b/papers/_sources/falsifiable_predictions.docx
@@ -3094,6 +3094,141 @@
       <w:r>
         <w:rPr>
           <w:b/>
+          <w:i w:val="0"/>
+        </w:rPr>
+        <w:t>The Measurement-Sector Predictions (added at v2.2.5, July 2026)</w:t>
+      </w:r>
+    </w:p>
+    <w:p>
+      <w:r>
+        <w:rPr>
+          <w:b w:val="0"/>
+          <w:i w:val="0"/>
+        </w:rPr>
+        <w:t>With the v2.2.5 cycle, the measurement chain — amplitude, detection event, reservoir, and reservoir spectrum — was constructed on literal strands (FND-STRAND-005 through 008), and a new family of falsifiable commitments follows, stated in the same discipline as the predictions above: what is committed, what is derived versus assumed, and what result would kill each. One structural caveat governs the family: the framework's standing absence of an absolute scale means several of these commit to SHAPES and RELATIONS while leaving locations in frequency or length open.</w:t>
+      </w:r>
+    </w:p>
+    <w:p>
+      <w:r>
+        <w:rPr>
+          <w:b/>
+          <w:i w:val="0"/>
+        </w:rPr>
+        <w:t>Prediction 7 — The Gapped Environmental Noise Floor (structural; scale-open)</w:t>
+      </w:r>
+    </w:p>
+    <w:p>
+      <w:r>
+        <w:rPr>
+          <w:b w:val="0"/>
+          <w:i w:val="0"/>
+        </w:rPr>
+        <w:t>The relation: the weave reservoir's normal-mode spectrum is gapped — every mode carries the strand mass, band [omega_gap, omega_gap sqrt(1 + 4 kt)], NO soft modes; environmental noise sourced by the fundamental medium arrives only at and above the gap. DERIVED: the gap's existence and the band shape, from the engine's own Hessian (FND-STRAND-008; matched to dispersion at 7e-16). OPEN: the gap's location in hertz. Falsifier: an established, irreducible, gapless environmental noise spectrum extending to zero frequency at every accessible scale, attributable to the fundamental medium rather than to ordinary matter environments.</w:t>
+      </w:r>
+    </w:p>
+    <w:p>
+      <w:r>
+        <w:rPr>
+          <w:b/>
+          <w:i w:val="0"/>
+        </w:rPr>
+        <w:t>Prediction 8 — Detection Is Nucleation Kinetics</w:t>
+      </w:r>
+    </w:p>
+    <w:p>
+      <w:r>
+        <w:rPr>
+          <w:b w:val="0"/>
+          <w:i w:val="0"/>
+        </w:rPr>
+        <w:t>The relation: the detector click is a thermally activated topological event (kink-pair nucleation, FND-STRAND-006/007), committing to the full first-passage package where the model applies: near-exponential waiting times at fixed drive, Arrhenius dark counts, latency decreasing with channel energy. DERIVED: the event's existence, localization, irreversibility, and channel-energy drive (Arrhenius-linear in amplitude-squared, r-squared 0.984). HONEST CAVEAT: parts of this package resemble known avalanche-detector phenomenology — the overlap is why the model is plausible, and the commitment is to the WHOLE package. Falsifier: confirmed click statistics that are non-activated and non-first-passage in a regime where the model's detector physics applies.</w:t>
+      </w:r>
+    </w:p>
+    <w:p>
+      <w:r>
+        <w:rPr>
+          <w:b/>
+          <w:i w:val="0"/>
+        </w:rPr>
+        <w:t>Prediction 9 — Spin-1/2 Requires Extension (in-principle)</w:t>
+      </w:r>
+    </w:p>
+    <w:p>
+      <w:r>
+        <w:rPr>
+          <w:b w:val="0"/>
+          <w:i w:val="0"/>
+        </w:rPr>
+        <w:t>The relation: the half-angle response is the SU(2) lift, which a point orientation cannot carry and a framed strand cannot avoid (FND-STRAND-005; measured at 1e-9 for arbitrary axes and profiles). Commitment: every spin-1/2 particle has internal structure at SOME finite scale. Scale-open, hence one-sided in practice: compositeness bounds may rise indefinitely without contradiction, but a CONFIRMED structureless point with spin-1/2 at all scales would falsify the mechanism outright.</w:t>
+      </w:r>
+    </w:p>
+    <w:p>
+      <w:r>
+        <w:rPr>
+          <w:b/>
+          <w:i w:val="0"/>
+        </w:rPr>
+        <w:t>Prediction 10 — Tsirelson Forever, with the Failed Organ Named</w:t>
+      </w:r>
+    </w:p>
+    <w:p>
+      <w:r>
+        <w:rPr>
+          <w:b w:val="0"/>
+          <w:i w:val="0"/>
+        </w:rPr>
+        <w:t>The relation: CHSH-type correlations never exceed 2 sqrt 2 — shared with quantum mechanics; distinctive here is the WHY and therefore the autopsy: supra-Tsirelson statistics require a setting-dependence channel of polynomial degree greater than 24 where this framework's physics has degree exactly 1 (QB-018/019/022). Falsifier: any confirmed loophole-free violation above 2 sqrt 2 — which kills the measurement sector at a named claim, not merely embarrasses it.</w:t>
+      </w:r>
+    </w:p>
+    <w:p>
+      <w:r>
+        <w:rPr>
+          <w:b/>
+          <w:i w:val="0"/>
+        </w:rPr>
+        <w:t>Prediction 11 — Born's Square from Channel Energy</w:t>
+      </w:r>
+    </w:p>
+    <w:p>
+      <w:r>
+        <w:rPr>
+          <w:b w:val="0"/>
+          <w:i w:val="0"/>
+        </w:rPr>
+        <w:t>The relation: the quadratic (p = 2) response near detection threshold is the statement that nucleation is driven by channel ENERGY, quadratic in amplitude (QB-011 protocol; FND-STRAND-005 B4, p = 1.99). Falsifier: a confirmed, reproducible deviation from quadratic threshold response — breaking the chain at a specific link (the energy-drive identification), leaving the rest standing for inspection.</w:t>
+      </w:r>
+    </w:p>
+    <w:p>
+      <w:r>
+        <w:rPr>
+          <w:b/>
+          <w:i w:val="0"/>
+        </w:rPr>
+        <w:t>Prediction 12 — Analog Universality (testable now)</w:t>
+      </w:r>
+    </w:p>
+    <w:p>
+      <w:r>
+        <w:rPr>
+          <w:b w:val="0"/>
+          <w:i w:val="0"/>
+        </w:rPr>
+        <w:t>The relation: any engineered system realizing the twist-chain physics — coupled pendulum arrays, magnetic domain-wall lattices, cold-atom sine-Gordon simulators — must exhibit the friction cliff (seven-order exponential mobility suppression, slope approximately -8.5 per width unit, arrest/coast dichotomy) with the LAW transferring across implementations and only prefactors carrying the coupling convention (FND-KIN-002; FND-STRAND-002, slope agreement 0.16 percent). Engineered filament brushes should likewise show the transparent-to-solid coverage crossover at gap approximately the contact size with the measured inverse-fourth-power approach (FND-STRAND-004). No knowledge of the absolute strand scale is required, because the experimenter builds the system; these are testable with current laboratory technique.</w:t>
+      </w:r>
+    </w:p>
+    <w:p>
+      <w:r>
+        <w:rPr>
+          <w:b w:val="0"/>
+          <w:i/>
+        </w:rPr>
+        <w:t>A retrodiction, declared as such: the Calugareanu ledger and the supercoiling instability (FND-STRAND-003) are confirmed daily by DNA mechanics — consistency evidence for the strand engine, counted here as retrodiction, not prediction.</w:t>
+      </w:r>
+    </w:p>
+    <w:p>
+      <w:r>
+        <w:rPr>
+          <w:b/>
         </w:rPr>
         <w:t>Registered Claims in This Paper</w:t>
       </w:r>
@@ -3112,6 +3247,36 @@
       </w:r>
       <w:r>
         <w:t>HEAVY-HYDRIDE 90-DEGREE ASYMPTOTE  [benchmark: benchmarks/em/heavy_hydride_asymptote.py]</w:t>
+      </w:r>
+    </w:p>
+    <w:p>
+      <w:r>
+        <w:t>• FND-STRAND-005 [Modeled]: THE INTERACTION MODEL ON LITERAL STRANDS — the framed strand is the SU(2) lift  [benchmark: benchmarks/foundations/strand_interaction_model.py]</w:t>
+      </w:r>
+    </w:p>
+    <w:p>
+      <w:r>
+        <w:t>• FND-STRAND-006 [Modeled]: THE NUCLEATION EVENT ON STRANDS — the dot as topological event  [benchmark: benchmarks/foundations/strand_nucleation.py]</w:t>
+      </w:r>
+    </w:p>
+    <w:p>
+      <w:r>
+        <w:t>• FND-STRAND-007 [Modeled]: THE WEAVE AS RESERVOIR — the bath derived  [benchmark: benchmarks/foundations/strand_weave_reservoir.py]</w:t>
+      </w:r>
+    </w:p>
+    <w:p>
+      <w:r>
+        <w:t>• FND-STRAND-008 [Modeled]: THE WEAVE SPECTRUM FROM THE ENGINE — the bath is gapped  [benchmark: benchmarks/foundations/strand_weave_spectrum.py]</w:t>
+      </w:r>
+    </w:p>
+    <w:p>
+      <w:r>
+        <w:t>• QB-019 [Derived]: MECHANISM-UNITY SELECTS TSIRELSON  [benchmark: benchmarks/bell/tsirelson_selection.py]</w:t>
+      </w:r>
+    </w:p>
+    <w:p>
+      <w:r>
+        <w:t>• QB-022 [Modeled]: MECHANISM-UNITY DECOMPOSED AND GROUNDED (SOVO)  [benchmark: benchmarks/bell/mechanism_unity_grounded.py]</w:t>
       </w:r>
     </w:p>
     <w:sectPr>

</xml_diff>

<commit_message>
The axis becomes a number
</commit_message>
<xml_diff>
--- a/papers/_sources/falsifiable_predictions.docx
+++ b/papers/_sources/falsifiable_predictions.docx
@@ -1551,11 +1551,7 @@
     </w:p>
     <w:p>
       <w:r>
-        <w:rPr>
-          <w:b w:val="0"/>
-          <w:i w:val="0"/>
-        </w:rPr>
-        <w:t>The framework's deepest open problem — deriving absolute particle masses (and hence atomic and molecular masses, and the absolute strand scale that would close the scale-open entries above) — is UNSOLVED. A systematic search ruled out eight natural mechanisms; dimensional transmutation was closed by a structural result. The framework openly publishes this failure alongside its successes.</w:t>
+        <w:t>The framework's deepest open problem — deriving absolute particle masses (and hence atomic and molecular masses, and the absolute strand scale that would close it) — now has a campaign and a receipt trail (see: The Mass of Matter Gets a Receipt). The mass model m = Sigma L + lambda [2 kc x contacts + bend(kappa)] has its structural terms fully derived: the contact term is an exact parity theorem and the bend law is closed with zero free parameters (dE x L = -0.509658 + 2 pi (5/2 - 7 sqrt2/4) ln L). The sector has since closed most of that gap from inside. The contact stiffness kc was DISSOLVED (the contact is a constraint, not a spring: an exact parity theorem, with the binding sign derived), and the scale lambda was taken through a full internal arc: collapsed by two identities (beaded string; waves at c) to one constant; its quantum reading KILLED by the framework's own Lorentz bound (an internal, arithmetic audit that also disfavored the doublet-as-n/p hypothesis in that reading); its surviving classical-amplitude reading made exactly extensive by a trace identity; its last parameter confiscated by collision saturation and closed by the density-onset principle at the tube's internal bundle (x equals the square root of the coverage threshold); and finally COMPUTED by percolation simulation: Lambda = 0.013 to 0.017 with zero free parameters, landing at the low edge of the phenomenological window. The conditioning sector is parameter-free -- m = T D (L - Lambda ell) -- and the single remaining scale input is T D itself, which now carries the absolute-mass question alone. The 1836.15 fork stands; every hypothesis-shaped statement remains marked; and the walls of the prototype solver, terminal-graded and congestion-gauged, gate the precision of every conditional until a production-grade solver arrives.</w:t>
       </w:r>
     </w:p>
     <w:p>

</xml_diff>

<commit_message>
The electron line, the constraint census, and two tooling repairs
</commit_message>
<xml_diff>
--- a/papers/_sources/falsifiable_predictions.docx
+++ b/papers/_sources/falsifiable_predictions.docx
@@ -15,7 +15,7 @@
         <w:rPr>
           <w:b/>
         </w:rPr>
-        <w:t>Seventeen Predictions and a Reproducibility Standard</w:t>
+        <w:t>Nineteen Predictions, One Discriminator, and a Reproducibility Standard</w:t>
       </w:r>
     </w:p>
     <w:p>
@@ -1083,6 +1083,108 @@
     </w:p>
     <w:p>
       <w:pPr>
+        <w:spacing w:after="160"/>
+      </w:pPr>
+      <w:r>
+        <w:rPr>
+          <w:b/>
+        </w:rPr>
+        <w:t xml:space="preserve">READER'S NOTE — the discrimination audit (added 1 August 2026)</w:t>
+      </w:r>
+    </w:p>
+    <w:p>
+      <w:pPr>
+        <w:spacing w:after="160"/>
+      </w:pPr>
+      <w:r>
+        <w:t xml:space="preserve">This paper lists nineteen predictions. A systematic audit on 1 August 2026 asked a narrower question of each: does its OBSERVABLE OUTCOME differ from what standard physics predicts, is it checkable, and is it live? Exactly ONE qualifies on all three. Readers should not take the count of nineteen as a count of ways this framework could be distinguished from standard physics.</w:t>
+      </w:r>
+    </w:p>
+    <w:p>
+      <w:pPr>
+        <w:spacing w:after="160"/>
+      </w:pPr>
+      <w:r>
+        <w:t xml:space="preserve">THE ONE: Prediction 6, d ln alpha = -2 d ln G. Confronted against published optical-clock and lunar-laser-ranging data (four independent alpha determinations, three independent G determinations) it holds at 1.74 sigma -- a null-versus-null consistency, so survival rather than confirmation. Its substance is the inverse commitment Gdot/G = -5.0(5.5)e-19 per year; any firm detection above 1.6e-18 per year refutes it. The named weak point is PSR J1713+0747, already 2.06 sigma against the relation on its own; a 3 sigma confirmation of its 2025 central value kills the claim and needs only a factor 1.45 in sigma, reachable around 2027-2030.</w:t>
+      </w:r>
+    </w:p>
+    <w:p>
+      <w:pPr>
+        <w:spacing w:after="160"/>
+      </w:pPr>
+      <w:r>
+        <w:rPr>
+          <w:b/>
+        </w:rPr>
+        <w:t xml:space="preserve">WHY THE OTHERS DO NOT DISCRIMINATE, in the audit's own terms:</w:t>
+      </w:r>
+    </w:p>
+    <w:p>
+      <w:pPr>
+        <w:spacing w:after="160"/>
+      </w:pPr>
+      <w:r>
+        <w:t xml:space="preserve">Prediction 3 (cosmic birefringence) is CONFIRMED -- Planck legacy data favours the constant-angle model by Bayesian evidence -- but the standard ultra-light axion predicts a constant angle too. The frequency scaling that would separate them was derived and closes the door: material optical activity gives beta ~ nu^2, excluded at 4.9 sigma and overshooting the observed angle by 7e18 at the framework's own strand scale. Only the axion's nu^0 survives, and it must be imported as a postulate.</w:t>
+      </w:r>
+    </w:p>
+    <w:p>
+      <w:pPr>
+        <w:spacing w:after="160"/>
+      </w:pPr>
+      <w:r>
+        <w:t xml:space="preserve">Prediction 2 (neutrino sum 58.5 meV) is sharply falsifiable -- inverted ordering or a sum away from 58-59 meV kills it -- but sits where any minimal-normal-ordering model lands, so a confirming measurement would not select this framework.</w:t>
+      </w:r>
+    </w:p>
+    <w:p>
+      <w:pPr>
+        <w:spacing w:after="160"/>
+      </w:pPr>
+      <w:r>
+        <w:t xml:space="preserve">Predictions 16 and 17 (black holes) are distinctive but not reachable. Hawking radiation has never been observed from any astrophysical hole, and the only channel where evaporation is observable needs a ~1e15 g primordial hole not known to exist. The whisper at 0.23 kappa is genuinely sourced in the gravitational channel -- a reconnection is purely deviatoric with 93 percent of its excited power in the Einstein-Hilbert channel -- but it is CHANNEL-SATURATED rather than supply-limited: the horizon at 0.23 kappa is a deep-sub-wavelength emitter, so the luminosity saturates at 5.8e-4 times the Hawking power, mass-independently -- about 5e-34 W for a stellar hole, giving a strain of order 1e-58 at 10 kpc. That is Hawking-faint by construction and NO DETECTION CLAIM IS MADE. The framework's OWN work closes it twice over: the spectrum is broadband quasi-thermal rather than a line, which forbids coherent integration, and the channel ceiling sits thirty orders below even that. See GRV-047 and GRV-053.</w:t>
+      </w:r>
+    </w:p>
+    <w:p>
+      <w:pPr>
+        <w:spacing w:after="160"/>
+      </w:pPr>
+      <w:r>
+        <w:t xml:space="preserve">Prediction 19 (polarimetry) is an ACCEPTANCE TEST, not a prediction: the branch that supports the framework is a QED-like result, which discriminates nothing since QED already predicts QED, and the branch that would discriminate requires a non-spinor rope electron the corpus has not built. It remains a valuable standing commitment -- if that electron is ever built non-spinor, the framework dies.</w:t>
+      </w:r>
+    </w:p>
+    <w:p>
+      <w:pPr>
+        <w:spacing w:after="160"/>
+      </w:pPr>
+      <w:r>
+        <w:t xml:space="preserve">Prediction 18 (medium rest frame) commits no specific observable, and its derivation inherits a relation retired with the mesoscopic-hbar sector.</w:t>
+      </w:r>
+    </w:p>
+    <w:p>
+      <w:pPr>
+        <w:spacing w:after="160"/>
+      </w:pPr>
+      <w:r>
+        <w:t xml:space="preserve">Prediction 1 (the MOND scale g+ = cH0/2pi at zero parameters) is a real achievement and does NOT discriminate, because MOND fits the same observable.</w:t>
+      </w:r>
+    </w:p>
+    <w:p>
+      <w:pPr>
+        <w:spacing w:after="160"/>
+      </w:pPr>
+      <w:r>
+        <w:t xml:space="preserve">A CORRECTION TO PREDICTION 19's SCOPE. The polarimetry axis was registered as the arbiter for the vacuum stiffness Sigma. It is not. Discriminating the two registered Sigma candidates needs a birefringence sensitivity roughly 5e8 beyond VMB@CERN's design goal. The axis is a THRESHOLD test on Sigma's branch (already passed, since PVLAS excludes the small-Sigma regime) and a genuine near-term test of the ELECTRON's internal class. Sigma's value is settled by calculation, not by that experiment.</w:t>
+      </w:r>
+    </w:p>
+    <w:p>
+      <w:pPr>
+        <w:spacing w:after="160"/>
+      </w:pPr>
+      <w:r>
+        <w:t xml:space="preserve">WHAT THE AUDIT DOES NOT SAY. None of the above means these predictions are wrong, and several remain genuinely falsifiable even where they cannot discriminate: the neutrino sum dies on inverted ordering, the polarimetry commitment dies on a non-spinor electron, the black-hole claims die if an evaporating primordial hole is found. What the audit says is narrower and should be stated plainly: this framework currently offers ONE way to be distinguished from standard physics, and several ways to be killed. The corpus also carries twenty-three registered Failed-and-kept claims, which is the more informative number about whether it can be falsified. Full reasoning: ELEC-062, ELEC-063, ELEC-064, GRV-049, GRV-052, PRED-002-CONF, PRED-002-FREQ, PRED-003-CONF, PRED-003-META, PRED-003-J1713, QGATE-018.</w:t>
+      </w:r>
+    </w:p>
+    <w:p>
+      <w:pPr>
         <w:pStyle w:val="Heading2"/>
       </w:pPr>
       <w:r>
@@ -1705,6 +1807,95 @@
     </w:p>
     <w:p>
       <w:pPr>
+        <w:spacing w:after="160"/>
+      </w:pPr>
+      <w:r>
+        <w:rPr>
+          <w:b/>
+        </w:rPr>
+        <w:t xml:space="preserve">Part VI — The Medium-Frame and Polarimetry Discriminators (added at v2.6)</w:t>
+      </w:r>
+    </w:p>
+    <w:p>
+      <w:pPr>
+        <w:spacing w:after="160"/>
+      </w:pPr>
+      <w:r>
+        <w:rPr>
+          <w:b/>
+        </w:rPr>
+        <w:t xml:space="preserve">Prediction 18 — The Medium's Rest Frame Is the CMB Frame</w:t>
+      </w:r>
+    </w:p>
+    <w:p>
+      <w:pPr>
+        <w:spacing w:after="160"/>
+      </w:pPr>
+      <w:r>
+        <w:t xml:space="preserve">The relation. If the vacuum is a material medium it defines a rest frame, and the CMB already defines one: we move at 370 km/s = 1.23e-3 c relative to it. The framework predicts THESE ARE THE SAME FRAME. A mismatch appears as medium anisotropy at order (v/c)^2 = 1.5e-6 in any medium-coupled observable.</w:t>
+      </w:r>
+    </w:p>
+    <w:p>
+      <w:pPr>
+        <w:spacing w:after="160"/>
+      </w:pPr>
+      <w:r>
+        <w:t xml:space="preserve">Inputs. DERIVED: that a material medium defines a frame at all, and the (v/c)^2 scaling of the resulting anisotropy. MEASURED: the solar-system velocity relative to the CMB.</w:t>
+      </w:r>
+    </w:p>
+    <w:p>
+      <w:pPr>
+        <w:spacing w:after="160"/>
+      </w:pPr>
+      <w:r>
+        <w:t xml:space="preserve">Test and falsifier. Any medium-coupled observable searched for a dipole or quadrupole anisotropy aligned with the CMB dipole at the 1e-6 level. Killed by a demonstrated medium-frame anisotropy misaligned with the CMB dipole. Registered claim: HBAR-010. Note: this prediction survives the retirement of the mesoscopic-hbar identification (ELEC-061), because it never used that length.</w:t>
+      </w:r>
+    </w:p>
+    <w:p>
+      <w:pPr>
+        <w:spacing w:after="160"/>
+      </w:pPr>
+      <w:r>
+        <w:rPr>
+          <w:b/>
+        </w:rPr>
+        <w:t xml:space="preserve">Prediction 19 — Vacuum Stiffness and the Photon Quartic on One Polarimetry Axis</w:t>
+      </w:r>
+    </w:p>
+    <w:p>
+      <w:pPr>
+        <w:spacing w:after="160"/>
+      </w:pPr>
+      <w:r>
+        <w:t xml:space="preserve">The relation. Consistency of additivity, Lorentz invariance and the corpus's coherence count forces the vacuum stiffness Sigma &gt;= 5.1e35 J/m^3. Because large Sigma makes the mesh's own nonlinearity invisible at PVLAS scales, observed vacuum birefringence must instead come from the matter sector, whose low-energy photon quartic is a fingerprint of the lightest charged particle's internal class: a spinor-equivalent electron gives the (4,7)-positive structure, and any non-spinor rope electron gives a deviation at the measurable 1e-23 scale — a 71 percent change in ratio plus a sign flip.</w:t>
+      </w:r>
+    </w:p>
+    <w:p>
+      <w:pPr>
+        <w:spacing w:after="160"/>
+      </w:pPr>
+      <w:r>
+        <w:t xml:space="preserve">Inputs. DERIVED: the Sigma bound from the stated consistency conditions; the (4,7) acceptance structure. NOT YET BUILT: the rope electron model itself, so the second half is a standing acceptance test rather than a completed prediction.</w:t>
+      </w:r>
+    </w:p>
+    <w:p>
+      <w:pPr>
+        <w:spacing w:after="160"/>
+      </w:pPr>
+      <w:r>
+        <w:t xml:space="preserve">Test and falsifier. A VMB@CERN-class polarimetry experiment reads both quantities on one axis. THE PAYOFF IS INVERTED relative to naive expectation: a QED-like birefringence result SUPPORTS the large-Sigma branch, while a rope-signature birefringence would kill it. Registered claims: QGATE-007, QGATE-010.</w:t>
+      </w:r>
+    </w:p>
+    <w:p>
+      <w:pPr>
+        <w:spacing w:after="160"/>
+      </w:pPr>
+      <w:r>
+        <w:t xml:space="preserve">Scale-chain note (added at v2.6). The vacuum stiffness above carries a registered 28 percent tension: the framework's flux-tube mass-density radius predicts 0.342 fm against 0.407(14) fm computed on the published lattice data of Baker et al., EPJ C 85, 29 (2025). Two scale sets are therefore registered in parallel — Sigma = 5.1e35 (framework) and 3.61e35 (lattice-anchored) — and the polarimetry axis above separates them. See ELEC-052, ELEC-053.</w:t>
+      </w:r>
+    </w:p>
+    <w:p>
+      <w:pPr>
         <w:pStyle w:val="Heading1"/>
       </w:pPr>
       <w:r>
@@ -1781,6 +1972,62 @@
           <w:i w:val="0"/>
         </w:rPr>
         <w:t>• QB-022 [Modeled]: MECHANISM-UNITY DECOMPOSED AND GROUNDED (SOVO)  [benchmark: benchmarks/bell/mechanism_unity_grounded.py]</w:t>
+      </w:r>
+    </w:p>
+    <w:p>
+      <w:pPr>
+        <w:spacing w:after="160"/>
+      </w:pPr>
+      <w:r>
+        <w:t xml:space="preserve">• GRV-039 [Modeled]: ISOLATED BLACK HOLES DO NOT EVAPORATE  [benchmark: benchmarks/grv/horizon_evaporation.py]</w:t>
+      </w:r>
+    </w:p>
+    <w:p>
+      <w:pPr>
+        <w:spacing w:after="160"/>
+      </w:pPr>
+      <w:r>
+        <w:t xml:space="preserve">• HBAR-010 [Modeled]: THE FORMATION-ERA MEDIUM MEETS COSMOLOGY — the medium frame is the CMB frame  [benchmark: benchmarks/foundations/hbar_cosmological_test.py]</w:t>
+      </w:r>
+    </w:p>
+    <w:p>
+      <w:pPr>
+        <w:spacing w:after="160"/>
+      </w:pPr>
+      <w:r>
+        <w:t xml:space="preserve">• QGATE-007 [Modeled]: THE VACUUM STIFFNESS BOUND Sigma &gt;= 5.1e35 J/m^3  [benchmark: benchmarks/qgate/vacuum_stiffness.py]</w:t>
+      </w:r>
+    </w:p>
+    <w:p>
+      <w:pPr>
+        <w:spacing w:after="160"/>
+      </w:pPr>
+      <w:r>
+        <w:t xml:space="preserve">• QGATE-010 [Modeled]: THE MATTER-SECTOR BIREFRINGENCE — the polarimetry axis becomes a spin-meter  [benchmark: benchmarks/qgate/matter_birefringence.py]</w:t>
+      </w:r>
+    </w:p>
+    <w:p>
+      <w:pPr>
+        <w:spacing w:after="160"/>
+      </w:pPr>
+      <w:r>
+        <w:t xml:space="preserve">• PRED-001 [Modeled]: THE NEUTRINO MASS SUM = 58.47 meV  [benchmark: benchmarks/foundations/pred_neutrino_mass_sum.py]</w:t>
+      </w:r>
+    </w:p>
+    <w:p>
+      <w:pPr>
+        <w:spacing w:after="160"/>
+      </w:pPr>
+      <w:r>
+        <w:t xml:space="preserve">• PRED-002 [Modeled]: COSMIC BIREFRINGENCE EB/EE = sin(4 beta)/2, FLAT IN MULTIPOLE  [benchmark: benchmarks/foundations/pred_cosmic_birefringence.py]</w:t>
+      </w:r>
+    </w:p>
+    <w:p>
+      <w:pPr>
+        <w:spacing w:after="160"/>
+      </w:pPr>
+      <w:r>
+        <w:t xml:space="preserve">• PRED-003 [Modeled]: THE COUPLING-DRIFT RATIO d ln alpha = -2 d ln G  [benchmark: benchmarks/foundations/pred_alpha_g_drift.py]</w:t>
       </w:r>
     </w:p>
     <w:sectPr>

</xml_diff>

<commit_message>
3.24 update - photon complete
</commit_message>
<xml_diff>
--- a/papers/_sources/falsifiable_predictions.docx
+++ b/papers/_sources/falsifiable_predictions.docx
@@ -19,7 +19,7 @@
         <w:pStyle w:val="BodyText"/>
       </w:pPr>
       <w:r>
-        <w:t xml:space="preserve">Mark Palmer · June 2026, rebuilt July 2026 (v2.2.5)</w:t>
+        <w:t xml:space="preserve">Mark Palmer · June 2026, rebuilt July 2026 (v2.2.5); release-synced to registry v3.24.0, August 2026</w:t>
       </w:r>
     </w:p>
     <w:p>
@@ -1288,7 +1288,7 @@
         <w:pStyle w:val="BodyText"/>
       </w:pPr>
       <w:r>
-        <w:t xml:space="preserve">This paper lists nineteen predictions. A systematic audit on 1 August 2026 asked a narrower question of each: does its OBSERVABLE OUTCOME differ from what standard physics predicts, is it checkable, and is it live? Exactly ONE qualifies on all three. Readers should not take the count of nineteen as a count of ways this framework could be distinguished from standard physics.</w:t>
+        <w:t xml:space="preserve">This paper lists nineteen predictions. A systematic audit on 1 August 2026 asked a narrower question of each: does its OBSERVABLE OUTCOME differ from what standard physics predicts, is it checkable, and is it live? At the 1 August audit, exactly ONE qualified on all three; the reconciliation and rulings of 12 August 2026 sharpen the count to TWO FIRM PLUS ONE CONDITIONAL (see the closing recount below). Readers should not take the count of nineteen as a count of ways this framework could be distinguished from standard physics.</w:t>
       </w:r>
     </w:p>
     <w:p>
@@ -1372,7 +1372,7 @@
         <w:pStyle w:val="BodyText"/>
       </w:pPr>
       <w:r>
-        <w:t xml:space="preserve">WHAT THE AUDIT DOES NOT SAY. None of the above means these predictions are wrong, and several remain genuinely falsifiable even where they cannot discriminate: the neutrino sum dies on inverted ordering, the polarimetry commitment dies on a non-spinor electron, the black-hole claims die if an evaporating primordial hole is found. What the audit says is narrower and should be stated plainly: this framework currently offers ONE way to be distinguished from standard physics, and several ways to be killed. The corpus also carries twenty-three registered Failed-and-kept claims, which is the more informative number about whether it can be falsified. Full reasoning: ELEC-062, ELEC-063, ELEC-064, GRV-049, GRV-052, PRED-002-CONF, PRED-002-FREQ, PRED-003-CONF, PRED-003-META, PRED-003-J1713, QGATE-018.</w:t>
+        <w:t xml:space="preserve">WHAT THE AUDIT DOES NOT SAY. None of the above means these predictions are wrong, and several remain genuinely falsifiable even where they cannot discriminate: the neutrino sum dies on inverted ordering, the polarimetry commitment dies on a non-spinor electron, the black-hole claims die if an evaporating primordial hole is found. What the audit says is narrower and should be stated plainly: this framework currently offers TWO FIRM ways to be distinguished from standard physics plus ONE CONDITIONAL, and several ways to be killed. The firm pair: (1) Prediction 6 (clock J1713, ~2027-2030); (2) Prediction 20's pin -- a resolved long-distance adjoint/fundamental ratio at -1.25 or -0.25 percent with C2-linear structure is a rope fingerprint, lattice-reachable now, its former grade conditionality discharged by author's ruling FND-093 with an armed return clause. The conditional: the FND-055 k-string statistic -- the corpus commits to exact Casimir bundle-binding where the standing record favors the sine law, a continuum SU(6) determination decides, retreat is pre-refused, and the decision bands are PRE-REGISTERED before any such determination exists (FND-092): k=2 softened-Casimir band [1.590, 1.598] versus sine 1.732, k=3 band [1.786, 1.797] versus 2.000, kill at three quoted errors above the band, no post-hoc adjustment on arrival. This is a way to be killed more than a way to be selected, and it is this list's sharpest member. The corpus also carries forty registered Failed-and-kept claims (regenerated from the v3.23.0 registry at this sync), which is the more informative number about whether it can be falsified. Full reasoning: ELEC-062, ELEC-063, ELEC-064, GRV-049, GRV-052, PRED-002-CONF, PRED-002-FREQ, PRED-003-CONF, PRED-003-META, PRED-003-J1713, QGATE-018.</w:t>
       </w:r>
     </w:p>
     <w:bookmarkStart w:id="23" w:name="prediction-1-the-mond-acceleration-scale"/>
@@ -1613,10 +1613,7 @@
         <w:pStyle w:val="BodyText"/>
       </w:pPr>
       <w:r>
-        <w:t xml:space="preserve">Test and falsifier. Testable now against combined bounds: quasar-absorption limits on α̇ and lunar-laser-ranging / pulsar-timing limits on Ġ. A measured drift ratio inconsistent with −2 (for tension-channel drift) falsifies the shared-tension structure. Two qualifications: (i) the −2 is PROVISIONAL on deriving G(T,κ,a) rigorously — the framework-forced content is a FIXED ratio, not the specific value; (ii) current data are consistent with no variation of either constant, so this is a bound and a standing prediction, not a detection.</w:t>
-      </w:r>
-      <w:r>
-        <w:t xml:space="preserve"> Second use (FND-043): a measured nonzero drift ratio selects the source length l_q’s composition, which through the inversion kappa_pack = (l_q/a ÷ 43.0)^6 reads off the vacuum packing -- one measurement, channel identification and vacuum metrology both.</w:t>
+        <w:t xml:space="preserve">Test and falsifier. Testable now against combined bounds: quasar-absorption limits on α̇ and lunar-laser-ranging / pulsar-timing limits on Ġ. A measured drift ratio inconsistent with −2 (for tension-channel drift) falsifies the shared-tension structure. Two qualifications: (i) the −2 is PROVISIONAL on deriving G(T,κ,a) rigorously — the framework-forced content is a FIXED ratio, not the specific value; (ii) current data are consistent with no variation of either constant, so this is a bound and a standing prediction, not a detection. Second use (FND-043): a measured nonzero drift ratio would select the source length l_q's composition and, through the registered inversion, read off the vacuum packing -- one measurement, channel identification and vacuum metrology both. This second use now carries two registered conditions, disclosed: FND-044 killed the dictionary composition table at number level (the compositional route to l_q is closed as computed), and the cross-link carries the named premise that the crossing contrast g is fixed under drift. The primary content of this prediction (the ratio -2, the J1713 clock, GRV-074 form-robustness) is untouched by either condition.</w:t>
       </w:r>
     </w:p>
     <w:bookmarkEnd w:id="29"/>
@@ -2247,6 +2244,29 @@
       </w:r>
     </w:p>
     <w:p>
+      <w:r>
+        <w:rPr>
+          <w:b/>
+        </w:rPr>
+        <w:t xml:space="preserve">THE PHOTON SECTOR AT HIGH ENERGY -- THE FAILURE, THE REPAIR, AND WHAT REMAINS OWED (FND-058..062; FND-083..091; status as of the v3.23.0 sync, 2026-08-12)</w:t>
+      </w:r>
+    </w:p>
+    <w:p>
+      <w:r>
+        <w:t xml:space="preserve">The failure, first, at full volume, because a reviewer must meet it here and not by archaeology. The medium as originally specified -- straight strands at the registered spacing -- cannot carry the observed PeV gamma rays: the transparency ceiling E_max ~ hbar c / a sits orders below the LHAASO photons, and the corpus's own adjudicated diagnosis is ANISOTROPY, not a cutoff -- PeV propagation confined to ~1e-9 of the sky, contradicting both the framework's Derived isotropic wave sector (FND-REL-002) and the all-sky source distribution. Four escapes were prosecuted and closed on locked bars before any repair was attempted: the loaded continuum, the collective mode, the operator class (via Gershgorin), and length-tuning (blocked by the electron anchors at fixed tension). Every accessible-energy result in this paper is untouched by the failure; the failure was registered openly and priced before it was repaired.</w:t>
+      </w:r>
+    </w:p>
+    <w:p>
+      <w:r>
+        <w:t xml:space="preserve">The repair, adopted and then largely derived (the SHIN arc, FND-083..091). The vacuum strand is a bundle of finer sub-strands under REDISTRIBUTED tension (T0_f = T0/n_sub -- c, Sigma, and both Lorentz margins exactly invariant, so the registered length-tuning conviction does not fire), over-resolved to a_f &lt;= lambda/4 at the highest carried photon energy, and hierarchically WOUND. The winding is not chosen: isotropy's own moment conditions force hierarchy depth two (a one-line theorem) and fix both pitch angles in closed form -- psi_1 = arcsin(1/sqrt 3) = 35.26 deg and psi_2 = arcsin(sqrt((15 + 2 sqrt 30)/35)) = 59.44 deg -- with the registered Lorentz floors selecting between the quadratic's roots, and the solution is unique up to level relabeling (exhaustive exact solve). Two kept failures bracket the adopted regime (loose winding scatters; pitch-matched winding Bragg-scatters); the homogenized regime passes all locked dispersion bars in 2D and, at the derived angles, the 3D two-polarization check on a triply-controlled instrument (FND-089). The framework's forced Lorentz-invariant wave sector is RE-DERIVED on the wound carriers at Derived grade, homogenized scope (FND-090), and the bending cost is priced as a registered constraint, kb &lt;= 0.126 T0_f a_f^2, consistent with the standing slender-fiber picture and armed against any future kb derivation (FND-091).</w:t>
+      </w:r>
+    </w:p>
+    <w:p>
+      <w:r>
+        <w:t xml:space="preserve">What remains owed, disclosed with numbers on it. The two absolute scales (m, the over-resolution factor, and n_sub, the sub-strand count) are underived -- the class where this corpus has always located its irreducible bottom -- and the discrete O((ka)^2) question is unchanged from the coarse medium. The soft falsifier stays armed: any confirmed astrophysical photon above m x 1.4 PeV forces m upward; because m is underived, that observation constrains rather than kills. The process failure that let the original ceiling stand unconfronted for as long as it did is registered, with the resulting house rule, in KNOWN_LIMITATIONS; as of v3.23.1 the limitation is RESOLVED and moved to the permanent record at docs/RESOLVED_LIMITATIONS.md (kept history preserved in full), with the residual general-class items -- the underived scales, the discrete O((ka)^2) question, the armed soft falsifier -- living in their standing corpus homes; this section is the resolution's paper-facing statement.</w:t>
+      </w:r>
+    </w:p>
+    <w:p>
       <w:pPr>
         <w:pStyle w:val="BodyText"/>
       </w:pPr>
@@ -2500,7 +2520,7 @@
     </w:p>
     <w:p>
       <w:r>
-        <w:t xml:space="preserve">Prediction 29 --- The Linked Cutoff. One lattice spacing supplies both the dispersion scale E_QG2 and the transparency ceiling E_max, locked in ratio E_QG2/E_max &gt;= sqrt(3) exactly. If quadratic subluminal dispersion is ever measured at scale X, the vacuum must become opaque to photons above X/sqrt(3). No other framework links these observables; a joint measurement is a fingerprint. KILL: a measured dispersion scale together with freely propagating photons above X/sqrt(3). Currently consistent (LHAASO PeV transparency vs the dispersive bound, five orders of headroom).</w:t>
+        <w:t xml:space="preserve">Prediction 29 --- The Linked Cutoff. One lattice spacing supplies both the dispersion scale E_QG2 and the transparency ceiling E_max, locked in ratio E_QG2/E_max &gt;= sqrt(3) exactly. If quadratic subluminal dispersion is ever measured at scale X, the vacuum must become opaque to photons above X/sqrt(3). No other framework links these observables; a joint measurement is a fingerprint. KILL: a measured dispersion scale together with freely propagating photons above X/sqrt(3). The earlier consistency line here (LHAASO PeV transparency vs the dispersive bound, five orders of headroom) is SUPERSEDED: the registered transparency ceiling sits orders below the observed PeV photons, and the corpus's adjudicated diagnosis, repair, and remaining scale debts are stated in full in the photon-sector section preceding Part VII. The linked-cutoff RELATION E_QG2/E_max &gt;= sqrt(3) stands as structure; Predictions 28 and 29 are both read subject to that section.</w:t>
       </w:r>
     </w:p>
     <w:p>
@@ -2534,7 +2554,7 @@
         <w:pStyle w:val="BodyText"/>
       </w:pPr>
       <w:r>
-        <w:t>Status: Modeled, conditional on FND-037 (Conjecture) at the FND-040 floors (kappa_pack &gt;= 50 / 250).</w:t>
+        <w:t>Status: Modeled, conditional on FND-037 (Conjecture) at the FND-040 floors (kappa_pack &gt;= 50 / 250); the earlier additional conditionality on FND-040's coefficient (the K_c = 0 corner question, FND-063/064) is DISCHARGED by author's ruling (FND-093, 2026-08-12): K_c is a contact-amplitude channel, a property of defect cores, and is absent from the core-free confining-mesh strands this prediction lives on -- endpoint contact at the terminating sources is disclosed as boundary-subleading, and the ruling carries an armed return clause (any core on the flux path, or endpoint contact at bulk order, returns it to adjudication). The forward numbers stand unconditioned for the mesh regime.</w:t>
       </w:r>
     </w:p>
     <w:p>
@@ -2566,7 +2586,7 @@
         <w:pStyle w:val="BodyText"/>
       </w:pPr>
       <w:r>
-        <w:t>Confrontation to date (FND-047). Bali’s continuum-extrapolated eight-representation SU(3) study (PRD 62, 114503, 2000) excludes violations above 5% to 1 fm: kappa_pack &gt;= 12.5, consistent with both readings, tightening neither. Decision table: 1.25% decides the 5% floor; 0.5% implies &gt;= 125; 0.25% reaches the continuum reading and tests the whole tower. Achievable modern lattice work in the 0.5-1 fm window, below adjoint screening.</w:t>
+        <w:t>Confrontation to date (FND-047). Bali’s continuum-extrapolated eight-representation SU(3) study (PRD 62, 114503, 2000) excludes violations above 5% to 1 fm: kappa_pack &gt;= 12.5, consistent with both readings, tightening neither. The floors themselves are no longer held by Conjecture alone: an in-corpus kill attempt (SHIN, FND-076) confronted the one-medium alternative that would have replaced them and excluded it by 50-137x through this prediction's own derived coefficient -- the floors have survived their first prosecution. Decision table: 1.25% decides the 5% floor; 0.5% implies &gt;= 125; 0.25% reaches the continuum reading and tests the whole tower. Achievable modern lattice work in the 0.5-1 fm window, below adjoint screening.</w:t>
       </w:r>
     </w:p>
     <w:p>
@@ -2581,10 +2601,8 @@
       <w:pPr>
         <w:pStyle w:val="BodyText"/>
       </w:pPr>
-      <w:r/>
-      <w:r/>
-      <w:r>
-        <w:t>Scope, DECIDED (FND-050, author’s grant, 2026-08-11): N-UNIVERSAL. The softening mechanism is claimed for SU(N) generally, not SU(3) alone — the derivations reference no colour number, and the corpus declines an N-dependence its derivations do not exhibit. The price is owned: SU(N&gt;=4) k-string tensions favour the sine law (Del Debbio et al., PRD 65, 021501), but k-strings are BUNDLES of k unit windings (by screening/N-ality and by this framework’s additive winding charge), so that data measures inter-tube BINDING rather than the single-source softening of this prediction. The framework therefore OWES a bundle-binding relation computed from the derived quartic, whose (N, k) form confronts sine-vs-Casimir (the laws differ at O(1/N^2)). A contradiction there would falsify the corpus, not merely miss; retreat to SU(3) scope afterwards is refused in advance. Running start, not evidence: the qualitative bundle prediction sigma_k &lt; k sigma_1 holds on every dataset under both laws. Calibrations remain SU(3)-anchored.</w:t>
+      <w:r>
+        <w:t>Scope, DECIDED (FND-050, author’s grant, 2026-08-11): N-UNIVERSAL. The softening mechanism is claimed for SU(N) generally, not SU(3) alone — the derivations reference no colour number, and the corpus declines an N-dependence its derivations do not exhibit. The price is owned: SU(N&gt;=4) k-string tensions favour the sine law (Del Debbio et al., PRD 65, 021501), but k-strings are BUNDLES of k unit windings (by screening/N-ality and by this framework’s additive winding charge), so that data measures inter-tube BINDING rather than the single-source softening of this prediction. That owed bundle-binding relation has since been COMPUTED (FND-055, AYIN): b_k = (k-1)/(N-1), the antisymmetric-Casimir fraction exactly, zero fitted coefficients -- so the continuum SU(6) k-string determination now adjudicates the granted structure DIRECTLY. The adverse lean is disclosed rather than softened: the registered record favors the sine law (+8.3 percent at ~2 percent errors), and FND-040's softening pushes this prediction further from that data, not closer. A contradiction there falsifies the corpus, not merely misses; retreat to SU(3) scope afterwards is refused in advance. Running start, not evidence: the qualitative bundle prediction sigma_k &lt; k sigma_1 holds on every dataset under both laws. Calibrations remain SU(3)-anchored.</w:t>
       </w:r>
     </w:p>
     <w:sectPr/>

</xml_diff>

<commit_message>
THE ENERGY BILL: the wave survives, and nothing in the vacuum is at rest
</commit_message>
<xml_diff>
--- a/papers/_sources/falsifiable_predictions.docx
+++ b/papers/_sources/falsifiable_predictions.docx
@@ -11,15 +11,15 @@
           <w:bCs/>
           <w:b/>
         </w:rPr>
-        <w:t>Twenty Predictions, One Discriminator, and a Reproducibility Standard</w:t>
-      </w:r>
-    </w:p>
-    <w:p>
-      <w:pPr>
-        <w:pStyle w:val="BodyText"/>
-      </w:pPr>
-      <w:r>
-        <w:t xml:space="preserve">Mark Palmer · June 2026, rebuilt July 2026 (v2.2.5); release-synced to registry v3.26.0, August 2026</w:t>
+        <w:t>Thirty-Three Predictions, One Discriminator, and a Reproducibility Standard</w:t>
+      </w:r>
+    </w:p>
+    <w:p>
+      <w:pPr>
+        <w:pStyle w:val="BodyText"/>
+      </w:pPr>
+      <w:r>
+        <w:t xml:space="preserve">Mark Palmer · June 2026, rebuilt July 2026 (v2.2.5); v2.3.0, 17 August 2026 -- the wave-arc reconciliation, release-synced to registry v3.26.77</w:t>
       </w:r>
     </w:p>
     <w:p>
@@ -44,7 +44,7 @@
         <w:pStyle w:val="FirstParagraph"/>
       </w:pPr>
       <w:r>
-        <w:t xml:space="preserve">This note collects the falsifiable predictions of the rope hypothesis in one place, for outside review. The hypothesis is a non-standard, self-published framework; nothing here asks the reader to accept its ontology. Each prediction is a stated mathematical relation with its inputs classified as derived or measured, its test named, and its falsifier spelled out. The inventory now stands at fifteen: four testable numbers (Part I), two structural consequences (Part II), three predictions from strand extensibility and molecular geometry (Part III), and the six-member measurement-sector family added at v2.2.5 from the strand-level campaign (Part IV), plus one declared retrodiction. This document supersedes all earlier prediction notes; it is the single inventory, maintained under one standard.</w:t>
+        <w:t xml:space="preserve">This note collects the falsifiable predictions of the rope hypothesis in one place, for outside review. The hypothesis is a non-standard, self-published framework; nothing here asks the reader to accept its ontology. Each prediction is a stated mathematical relation with its inputs classified as derived or measured, its test named, and its falsifier spelled out. The inventory stood at fifteen at v2.2.5 and now stands at thirty-three live entries after the v2.3.0 reconciliation (Part IX): four testable numbers (Part I), two structural consequences (Part II), three predictions from strand extensibility and molecular geometry (Part III), and the six-member measurement-sector family added at v2.2.5 from the strand-level campaign (Part IV), plus the strong-field, measurement-sector, and lattice additions of Parts V-VIII, one declared retrodiction, and the wave-arc entries of Part IX (Predictions 32-34, added at v2.3.0). This document supersedes all earlier prediction notes; it is the single inventory, maintained under one standard.</w:t>
       </w:r>
     </w:p>
     <w:bookmarkEnd w:id="20"/>
@@ -2258,7 +2258,7 @@
     </w:p>
     <w:p>
       <w:r>
-        <w:t xml:space="preserve">The repair, adopted and then largely derived (the SHIN arc, FND-083..091). The vacuum strand is a bundle of finer sub-strands under REDISTRIBUTED tension (T0_f = T0/n_sub -- c, Sigma, and both Lorentz margins exactly invariant, so the registered length-tuning conviction does not fire), over-resolved to a_f &lt;= lambda/4 at the highest carried photon energy, and hierarchically WOUND. The winding is not chosen: isotropy's own moment conditions force hierarchy depth two (a one-line theorem) and fix both pitch angles in closed form -- psi_1 = arcsin(1/sqrt 3) = 35.26 deg and psi_2 = arcsin(sqrt((15 + 2 sqrt 30)/35)) = 59.44 deg -- with the registered Lorentz floors selecting between the quadratic's roots, and the solution is unique up to level relabeling (exhaustive exact solve). Two kept failures bracket the adopted regime (loose winding scatters; pitch-matched winding Bragg-scatters); the homogenized regime passes all locked dispersion bars in 2D and, at the derived angles, the 3D two-polarization check on a triply-controlled instrument (FND-089). The framework's forced Lorentz-invariant wave sector is RE-DERIVED on the wound carriers at Derived grade, homogenized scope (FND-090), and the bending cost is priced as a registered constraint, kb &lt;= 0.126 T0_f a_f^2, consistent with the standing slender-fiber picture and armed against any future kb derivation (FND-091).</w:t>
+        <w:t xml:space="preserve">The repair, adopted and then largely derived (the SHIN arc, FND-083..091). The vacuum strand is a bundle of finer sub-strands under REDISTRIBUTED tension (T0_f = T0/n_sub -- c, Sigma, and both Lorentz margins exactly invariant, so the registered length-tuning conviction does not fire), over-resolved to a_f &lt;= lambda/4 at the highest carried photon energy, and hierarchically WOUND. The winding is not chosen: isotropy's own moment conditions force hierarchy depth two (a one-line theorem) and fix both pitch angles in closed form -- psi_1 = arcsin(1/sqrt 3) = 35.26 deg and psi_2 = arcsin(sqrt((15 + 2 sqrt 30)/35)) = 59.44 deg -- with the registered Lorentz floors selecting between the quadratic's roots, and the solution is unique up to level relabeling (exhaustive exact solve). Two kept failures bracket the adopted regime (loose winding scatters; pitch-matched winding Bragg-scatters); the homogenized regime passes all locked dispersion bars in 2D and, at the derived angles, the 3D two-polarization check on a triply-controlled instrument (FND-089). The framework's forced Lorentz-invariant wave sector is RE-DERIVED on the wound carriers at Derived grade, homogenized scope (FND-090), and the bending cost is priced as a registered constraint, kb &lt;= 0.126 T0_f a_f^2, armed against any future kb derivation (FND-091). THAT TRIPWIRE FIRED, exactly as published: the 17 Aug 2026 arc determined the twist channel, forced the winding into a rotating-wave state, and executed the saturation grant by its own condition 1 -- the standing constraint is now kb &lt;= 0.07909 T0_f a_f^2 (bound-with-named-gap; FND-131), with r_s &lt;= 0.1874 a_f. The fired clause is recorded, not deleted: a prediction paper that publishes a tripwire in July and reports it firing in August is doing what this standard is for.</w:t>
       </w:r>
     </w:p>
     <w:p>
@@ -2603,6 +2603,64 @@
       </w:pPr>
       <w:r>
         <w:t>Scope, DECIDED (FND-050, author’s grant, 2026-08-11): N-UNIVERSAL. The softening mechanism is claimed for SU(N) generally, not SU(3) alone — the derivations reference no colour number, and the corpus declines an N-dependence its derivations do not exhibit. The price is owned: SU(N&gt;=4) k-string tensions favour the sine law (Del Debbio et al., PRD 65, 021501), but k-strings are BUNDLES of k unit windings (by screening/N-ality and by this framework’s additive winding charge), so that data measures inter-tube BINDING rather than the single-source softening of this prediction. That owed bundle-binding relation has since been COMPUTED (FND-055, AYIN): b_k = (k-1)/(N-1), the antisymmetric-Casimir fraction exactly, zero fitted coefficients -- and the adjudication has since FIRED (FND-101, Commission NUN, 2026-08-13): the Athenodorou-Teper 2021 continuum determination (JHEP 12 (2021) 082; N = 2..12) rejects the sine law's functional class (zero 1/N coefficient) in favour of a nonzero leading-1/N binding at chi2/ndf 0.5 versus 2.2, superseding the old sine-favouring record -- the derived law's CLASS is confirmed by continuum data -- while convicting its exact coefficient: measured 1.28(19)/N against the derived 2/N, a 3.8 sigma miss, with FND-040's softening disclosed and again adverse. At point level the FND-092 kill clause FIRED (FND-102, Failed and kept): the SU(6) continuum point 1.654(13) is 4.3 sigma above the pre-registered softened band top, 4.15 sigma above exact Casimir, and 6.0 sigma below sine -- the vacuum sits strictly between the laws, and the exchange-counting normalization is falsified at its own checkpoint while the 1/N class stands. What is now owed is the shortfall mechanism, a blind two-number target: b/b_CS = 0.865(33) at SU(6) and 0.64(10) asymptotic. Retreat to SU(3) scope remains refused in advance. Running start unchanged: the qualitative bundle prediction sigma_k &lt; k sigma_1 holds on every dataset under both laws. Calibrations remain SU(3)-anchored.</w:t>
+      </w:r>
+    </w:p>
+    <w:p>
+      <w:r>
+        <w:rPr>
+          <w:b/>
+          <w:sz w:val="28"/>
+        </w:rPr>
+        <w:t xml:space="preserve">Part IX -- The v2.3.0 Reconciliation: The Wave Arc (added 17 August 2026, registry v3.26.77)</w:t>
+      </w:r>
+    </w:p>
+    <w:p>
+      <w:r>
+        <w:t xml:space="preserve">On 17 August 2026 an eight-release arc (FND-126..132) resolved the fine sector's mechanics: k/T0 = 2 is closed as adopted at instrument class; the fine weave is contact-free by grant; the winding is a rotating-wave state, forced not adopted (level-1 wave at sqrt(3/2) c; material orbit at exactly c); and the vacuum's zero-point energy acquires a mechanical identity -- it is the winding's rotation. All 31 prior entries were audited against the new registry: 28 stand unchanged, Prediction 8 is SHARPENED (the fine longitudinal channel is now a completed number, c_L,f = 3.00 c, with the &gt;= 4.046 falsifier inherited), Prediction 19 carries a naming flag (Sigma_wave, the wave total at 2.6-4.5 T0/a^2-class, is a distinct object from Sigma_vac), Prediction 7 carries the c4-family caution of FND-127, and zero entries were retired by the arc. Full audit: docs/PREDICTIONS_RECONCILIATION_v3_26_77.md.</w:t>
+      </w:r>
+    </w:p>
+    <w:p>
+      <w:r>
+        <w:rPr>
+          <w:b/>
+        </w:rPr>
+        <w:t xml:space="preserve">Prediction 32 -- The Zero-Point Share Band (two-sided)</w:t>
+      </w:r>
+    </w:p>
+    <w:p>
+      <w:r>
+        <w:t xml:space="preserve">The number: the dynamical (zero-point) fraction of the vacuum's energy budget is [0.615, 0.779] -- the lower edge EXACT (level-1 rotating-wave kinetics, forced by FND-130/131), the upper edge closing with the chartered composite build. Inputs: DERIVED only (the forced wave state; the magic-angle kinematics; T_fibre = 3/2). Test and falsifier: any independent determination of the vacuum zero-point share below 0.615 falsifies the wave reading outright; above 0.779 falsifies the two-level bracket. This converts FND-MATTER-041's one-sided survival ceiling (share &lt; 0.889) into a two-sided committed band. Claims: FND-130, FND-131, FND-132, FND-MATTER-041.</w:t>
+      </w:r>
+    </w:p>
+    <w:p>
+      <w:r>
+        <w:rPr>
+          <w:b/>
+        </w:rPr>
+        <w:t xml:space="preserve">Prediction 33 (Structural) -- The Vacuum Rotation Quantum and the PeV Coincidence</w:t>
+      </w:r>
+    </w:p>
+    <w:p>
+      <w:r>
+        <w:t xml:space="preserve">The shape: the level-1 winding's material orbit at c on radius R_1 = 0.22508 a_f defines a rotation quantum E_rot = hbar c / R_1 = 3.96 PeV at the a_f ceiling, scaling as 1/a_f -- the same class as the independently derived photon-sector ceiling (m x 1.4 PeV, FND-086/087), and locked to move with it under any future a_f determination. Inputs: DERIVED (corrected winding geometry, FND-125/126; the material-orbit identity, FND-132). Test: vacuum spectral structure in the PeV window, co-moving with the photon ceiling; an a_f determination separating the two scales adjudicates the coincidence. Claims: FND-132, FND-086/087.</w:t>
+      </w:r>
+    </w:p>
+    <w:p>
+      <w:r>
+        <w:rPr>
+          <w:b/>
+        </w:rPr>
+        <w:t xml:space="preserve">Prediction 34 (Consistency-tier) -- The Level-2 Wave Speed Lock</w:t>
+      </w:r>
+    </w:p>
+    <w:p>
+      <w:r>
+        <w:t xml:space="preserve">The relation: any independent determination of kb predicts the level-2 winding wave speed with zero freedom, v_2 = sqrt(3/2 + 17.926 kb) c (kb in T0_f a_f^2; the coefficient is 2 pi^2 s (3s - 1) at the derived level-2 angle). At the standing bound, v_2 &lt;= 1.71 c. Falsifier: a (kb, v_2) pair off the curve. Companion armed tripwire: the material-orbit identity v_m = c holds iff T_fibre = 3/2 -- any tension re-pricing moves it off c by name. Claims: FND-130, FND-132.</w:t>
+      </w:r>
+    </w:p>
+    <w:p>
+      <w:r>
+        <w:t xml:space="preserve">Deliberately not added: the Casimir coefficient from the winding spectrum. It became computable in principle when zero-point energy acquired its mechanical identity (FND-132), and the commission is chartered with its success criterion (reproduce pi^2/240, or the deviation with a sign and size) and failure mode pre-named -- but this paper contains only computed numbers, and that one has not been computed. It enters when it exists.</w:t>
       </w:r>
     </w:p>
     <w:sectPr/>

</xml_diff>